<commit_message>
Remove author information from report files
</commit_message>
<xml_diff>
--- a/PROJECT_REPORT.docx
+++ b/PROJECT_REPORT.docx
@@ -54,10 +54,7 @@
           </w:tcPr>
           <w:p>
             <w:r>
-              <w:rPr>
-                <w:b/>
-              </w:rPr>
-              <w:t>Author: Neel</w:t>
+              <w:t>Domain: Music Information Retrieval &amp; RecSys</w:t>
             </w:r>
           </w:p>
         </w:tc>
@@ -74,43 +71,7 @@
           </w:tcPr>
           <w:p>
             <w:r>
-              <w:t>Domain: Music Information Retrieval &amp; RecSys</w:t>
-            </w:r>
-          </w:p>
-        </w:tc>
-      </w:tr>
-      <w:tr>
-        <w:tc>
-          <w:tcPr>
-            <w:tcW w:type="dxa" w:w="4680"/>
-            <w:shd w:fill="F1F5F9"/>
-            <w:tcMar>
-              <w:top w:w="80" w:type="dxa"/>
-              <w:bottom w:w="80" w:type="dxa"/>
-              <w:left w:w="120" w:type="dxa"/>
-              <w:right w:w="120" w:type="dxa"/>
-            </w:tcMar>
-          </w:tcPr>
-          <w:p>
-            <w:r>
               <w:t>Date: October 2026</w:t>
-            </w:r>
-          </w:p>
-        </w:tc>
-        <w:tc>
-          <w:tcPr>
-            <w:tcW w:type="dxa" w:w="4680"/>
-            <w:shd w:fill="F1F5F9"/>
-            <w:tcMar>
-              <w:top w:w="80" w:type="dxa"/>
-              <w:bottom w:w="80" w:type="dxa"/>
-              <w:left w:w="120" w:type="dxa"/>
-              <w:right w:w="120" w:type="dxa"/>
-            </w:tcMar>
-          </w:tcPr>
-          <w:p>
-            <w:r>
-              <w:t>Status: Final Project Report</w:t>
             </w:r>
           </w:p>
         </w:tc>

</xml_diff>